<commit_message>
fix: update document output with revised content
</commit_message>
<xml_diff>
--- a/output/doc/测试简历.docx
+++ b/output/doc/测试简历.docx
@@ -4,13 +4,13 @@
   <w:body>
     <w:p>
       <w:pPr>
-        <w:spacing w:before="0" w:after="0" w:line="240" w:lineRule="auto"/>
+        <w:spacing w:after="0"/>
         <w:jc w:val="center"/>
       </w:pPr>
       <w:r>
         <w:drawing>
           <wp:inline xmlns:a="http://schemas.openxmlformats.org/drawingml/2006/main" xmlns:pic="http://schemas.openxmlformats.org/drawingml/2006/picture">
-            <wp:extent cx="7560000" cy="10692000"/>
+            <wp:extent cx="7308000" cy="10334590"/>
             <wp:docPr id="1" name="Picture 1"/>
             <wp:cNvGraphicFramePr>
               <a:graphicFrameLocks noChangeAspect="1"/>
@@ -19,7 +19,7 @@
               <a:graphicData uri="http://schemas.openxmlformats.org/drawingml/2006/picture">
                 <pic:pic>
                   <pic:nvPicPr>
-                    <pic:cNvPr id="0" name="resume_docx_preview.png"/>
+                    <pic:cNvPr id="0" name="source.png"/>
                     <pic:cNvPicPr/>
                   </pic:nvPicPr>
                   <pic:blipFill>
@@ -31,7 +31,7 @@
                   <pic:spPr>
                     <a:xfrm>
                       <a:off x="0" y="0"/>
-                      <a:ext cx="7560000" cy="10692000"/>
+                      <a:ext cx="7308000" cy="10334590"/>
                     </a:xfrm>
                     <a:prstGeom prst="rect"/>
                   </pic:spPr>
@@ -41,10 +41,83 @@
           </wp:inline>
         </w:drawing>
       </w:r>
+      <w:r>
+        <w:rPr>
+          <w:rFonts w:ascii="Arial" w:hAnsi="Arial" w:eastAsia="Arial"/>
+          <w:vanish/>
+          <w:sz w:val="2"/>
+        </w:rPr>
+        <w:t>张晨</w:t>
+        <w:br/>
+        <w:t>前端开发工程师｜测试用简历</w:t>
+        <w:br/>
+        <w:t>138-0000-0000</w:t>
+        <w:br/>
+        <w:t>zhangchen@example.com</w:t>
+        <w:br/>
+        <w:t>上海市｜3 年工作经验</w:t>
+        <w:br/>
+        <w:br/>
+        <w:t>个人概述</w:t>
+        <w:br/>
+        <w:t>具备 Web 应用开发与性能优化经验，熟悉现代前端工程化流程，可独立完成需求分析、开发、测试与上线支持。</w:t>
+        <w:br/>
+        <w:t>本文件仅用于系统上传、简历解析与版式展示测试，联系方式和经历均为虚构信息。</w:t>
+        <w:br/>
+        <w:br/>
+        <w:t>核心技能</w:t>
+        <w:br/>
+        <w:t>JavaScript / TypeScript</w:t>
+        <w:br/>
+        <w:t>React / Vue</w:t>
+        <w:br/>
+        <w:t>HTML5 / CSS3</w:t>
+        <w:br/>
+        <w:t>Vite / Webpack</w:t>
+        <w:br/>
+        <w:t>Node.js / Express</w:t>
+        <w:br/>
+        <w:t>Git / CI/CD</w:t>
+        <w:br/>
+        <w:t>RESTful API</w:t>
+        <w:br/>
+        <w:t>MySQL / Redis</w:t>
+        <w:br/>
+        <w:br/>
+        <w:t>工作经历</w:t>
+        <w:br/>
+        <w:t>2023.07 - 至今｜星云科技有限公司｜前端开发工程师</w:t>
+        <w:br/>
+        <w:t>负责企业招聘管理平台的前端功能迭代，完成 20+ 个业务页面的开发与维护。</w:t>
+        <w:br/>
+        <w:t>优化列表渲染与资源加载策略，核心页面首屏加载时间降低约 35%。</w:t>
+        <w:br/>
+        <w:t>与产品、后端及测试协作，建立接口联调与异常提示规范，提升交付稳定性。</w:t>
+        <w:br/>
+        <w:br/>
+        <w:t>项目经历</w:t>
+        <w:br/>
+        <w:t>智能面试助手平台｜2024.03 - 2024.08</w:t>
+        <w:br/>
+        <w:t>技术栈：React、TypeScript、Node.js、MySQL</w:t>
+        <w:br/>
+        <w:t>实现简历上传、岗位匹配、模拟面试和结果反馈等模块，支持多端响应式展示。</w:t>
+        <w:br/>
+        <w:t>设计统一的请求封装与错误处理机制，覆盖加载、空状态和请求失败等测试场景。</w:t>
+        <w:br/>
+        <w:br/>
+        <w:t>教育背景</w:t>
+        <w:br/>
+        <w:t>2017.09 - 2021.06｜华东理工大学｜软件工程｜本科</w:t>
+        <w:br/>
+        <w:t>主修课程：数据结构、计算机网络、数据库原理、软件工程与 Web 开发。</w:t>
+        <w:br/>
+        <w:t>测试简历 - 非真实个人信息</w:t>
+      </w:r>
     </w:p>
     <w:sectPr>
       <w:pgSz w:w="11906" w:h="16838"/>
-      <w:pgMar w:top="0" w:right="0" w:bottom="0" w:left="0" w:header="0" w:footer="0" w:gutter="0"/>
+      <w:pgMar w:top="198" w:right="198" w:bottom="198" w:left="198" w:header="720" w:footer="720" w:gutter="0"/>
       <w:cols w:space="720"/>
       <w:docGrid w:linePitch="360"/>
     </w:sectPr>

</xml_diff>